<commit_message>
Replace VIKOR formula images with native Word OMML equations
Co-authored-by: sazmanfava854-sudo <sazmanfava854-sudo@users.noreply.github.com>
</commit_message>
<xml_diff>
--- a/docs/4-5-2_VIKOR_Ranking.docx
+++ b/docs/4-5-2_VIKOR_Ranking.docx
@@ -62,40 +62,232 @@
       <w:pPr>
         <w:jc w:val="center"/>
       </w:pPr>
-      <w:r>
-        <w:drawing>
-          <wp:inline xmlns:a="http://schemas.openxmlformats.org/drawingml/2006/main" xmlns:pic="http://schemas.openxmlformats.org/drawingml/2006/picture">
-            <wp:extent cx="5220000" cy="2313129"/>
-            <wp:docPr id="1" name="Picture 1"/>
-            <wp:cNvGraphicFramePr>
-              <a:graphicFrameLocks noChangeAspect="1"/>
-            </wp:cNvGraphicFramePr>
-            <a:graphic>
-              <a:graphicData uri="http://schemas.openxmlformats.org/drawingml/2006/picture">
-                <pic:pic>
-                  <pic:nvPicPr>
-                    <pic:cNvPr id="0" name="image.png"/>
-                    <pic:cNvPicPr/>
-                  </pic:nvPicPr>
-                  <pic:blipFill>
-                    <a:blip r:embed="rId9"/>
-                    <a:stretch>
-                      <a:fillRect/>
-                    </a:stretch>
-                  </pic:blipFill>
-                  <pic:spPr>
-                    <a:xfrm>
-                      <a:off x="0" y="0"/>
-                      <a:ext cx="5220000" cy="2313129"/>
-                    </a:xfrm>
-                    <a:prstGeom prst="rect"/>
-                  </pic:spPr>
-                </pic:pic>
-              </a:graphicData>
-            </a:graphic>
-          </wp:inline>
-        </w:drawing>
-      </w:r>
+      <m:oMathPara>
+        <m:oMath>
+          <m:box>
+            <m:e>
+              <m:sSub>
+                <m:e>
+                  <m:r>
+                    <m:rPr>
+                      <m:sty m:val="i"/>
+                    </m:rPr>
+                    <m:t>S</m:t>
+                  </m:r>
+                </m:e>
+                <m:sub>
+                  <m:r>
+                    <m:rPr>
+                      <m:sty m:val="i"/>
+                    </m:rPr>
+                    <m:t>i</m:t>
+                  </m:r>
+                </m:sub>
+              </m:sSub>
+              <m:r>
+                <m:rPr>
+                  <m:sty m:val="p"/>
+                </m:rPr>
+                <m:t>=</m:t>
+              </m:r>
+              <m:nary>
+                <m:naryPr>
+                  <m:chr m:val="∑"/>
+                  <m:limLoc m:val="undOvr"/>
+                </m:naryPr>
+                <m:sub>
+                  <m:box>
+                    <m:e>
+                      <m:r>
+                        <m:rPr>
+                          <m:sty m:val="i"/>
+                        </m:rPr>
+                        <m:t>j</m:t>
+                      </m:r>
+                      <m:r>
+                        <m:rPr>
+                          <m:sty m:val="p"/>
+                        </m:rPr>
+                        <m:t>=</m:t>
+                      </m:r>
+                      <m:r>
+                        <m:rPr>
+                          <m:sty m:val="p"/>
+                        </m:rPr>
+                        <m:t>1</m:t>
+                      </m:r>
+                    </m:e>
+                  </m:box>
+                </m:sub>
+                <m:sup>
+                  <m:box>
+                    <m:e>
+                      <m:r>
+                        <m:rPr>
+                          <m:sty m:val="i"/>
+                        </m:rPr>
+                        <m:t>n</m:t>
+                      </m:r>
+                    </m:e>
+                  </m:box>
+                </m:sup>
+                <m:e>
+                  <m:sSub>
+                    <m:e>
+                      <m:r>
+                        <m:rPr>
+                          <m:sty m:val="i"/>
+                        </m:rPr>
+                        <m:t>w</m:t>
+                      </m:r>
+                    </m:e>
+                    <m:sub>
+                      <m:r>
+                        <m:rPr>
+                          <m:sty m:val="i"/>
+                        </m:rPr>
+                        <m:t>j</m:t>
+                      </m:r>
+                    </m:sub>
+                  </m:sSub>
+                  <m:f>
+                    <m:num>
+                      <m:box>
+                        <m:e>
+                          <m:sSubSup>
+                            <m:e>
+                              <m:r>
+                                <m:rPr>
+                                  <m:sty m:val="i"/>
+                                </m:rPr>
+                                <m:t>f</m:t>
+                              </m:r>
+                            </m:e>
+                            <m:sub>
+                              <m:r>
+                                <m:rPr>
+                                  <m:sty m:val="i"/>
+                                </m:rPr>
+                                <m:t>j</m:t>
+                              </m:r>
+                            </m:sub>
+                            <m:sup>
+                              <m:r>
+                                <m:rPr>
+                                  <m:sty m:val="p"/>
+                                </m:rPr>
+                                <m:t>*</m:t>
+                              </m:r>
+                            </m:sup>
+                          </m:sSubSup>
+                          <m:r>
+                            <m:rPr>
+                              <m:sty m:val="p"/>
+                            </m:rPr>
+                            <m:t>−</m:t>
+                          </m:r>
+                          <m:sSub>
+                            <m:e>
+                              <m:r>
+                                <m:rPr>
+                                  <m:sty m:val="i"/>
+                                </m:rPr>
+                                <m:t>f</m:t>
+                              </m:r>
+                            </m:e>
+                            <m:sub>
+                              <m:box>
+                                <m:e>
+                                  <m:r>
+                                    <m:rPr>
+                                      <m:sty m:val="i"/>
+                                    </m:rPr>
+                                    <m:t>i</m:t>
+                                  </m:r>
+                                  <m:r>
+                                    <m:rPr>
+                                      <m:sty m:val="i"/>
+                                    </m:rPr>
+                                    <m:t>j</m:t>
+                                  </m:r>
+                                </m:e>
+                              </m:box>
+                            </m:sub>
+                          </m:sSub>
+                        </m:e>
+                      </m:box>
+                    </m:num>
+                    <m:den>
+                      <m:box>
+                        <m:e>
+                          <m:sSubSup>
+                            <m:e>
+                              <m:r>
+                                <m:rPr>
+                                  <m:sty m:val="i"/>
+                                </m:rPr>
+                                <m:t>f</m:t>
+                              </m:r>
+                            </m:e>
+                            <m:sub>
+                              <m:r>
+                                <m:rPr>
+                                  <m:sty m:val="i"/>
+                                </m:rPr>
+                                <m:t>j</m:t>
+                              </m:r>
+                            </m:sub>
+                            <m:sup>
+                              <m:r>
+                                <m:rPr>
+                                  <m:sty m:val="p"/>
+                                </m:rPr>
+                                <m:t>*</m:t>
+                              </m:r>
+                            </m:sup>
+                          </m:sSubSup>
+                          <m:r>
+                            <m:rPr>
+                              <m:sty m:val="p"/>
+                            </m:rPr>
+                            <m:t>−</m:t>
+                          </m:r>
+                          <m:sSubSup>
+                            <m:e>
+                              <m:r>
+                                <m:rPr>
+                                  <m:sty m:val="i"/>
+                                </m:rPr>
+                                <m:t>f</m:t>
+                              </m:r>
+                            </m:e>
+                            <m:sub>
+                              <m:r>
+                                <m:rPr>
+                                  <m:sty m:val="i"/>
+                                </m:rPr>
+                                <m:t>j</m:t>
+                              </m:r>
+                            </m:sub>
+                            <m:sup>
+                              <m:r>
+                                <m:rPr>
+                                  <m:sty m:val="p"/>
+                                </m:rPr>
+                                <m:t>−</m:t>
+                              </m:r>
+                            </m:sup>
+                          </m:sSubSup>
+                        </m:e>
+                      </m:box>
+                    </m:den>
+                  </m:f>
+                </m:e>
+              </m:nary>
+            </m:e>
+          </m:box>
+        </m:oMath>
+      </m:oMathPara>
     </w:p>
     <w:p>
       <w:pPr>
@@ -143,40 +335,226 @@
       <w:pPr>
         <w:jc w:val="center"/>
       </w:pPr>
-      <w:r>
-        <w:drawing>
-          <wp:inline xmlns:a="http://schemas.openxmlformats.org/drawingml/2006/main" xmlns:pic="http://schemas.openxmlformats.org/drawingml/2006/picture">
-            <wp:extent cx="5220000" cy="1517003"/>
-            <wp:docPr id="2" name="Picture 2"/>
-            <wp:cNvGraphicFramePr>
-              <a:graphicFrameLocks noChangeAspect="1"/>
-            </wp:cNvGraphicFramePr>
-            <a:graphic>
-              <a:graphicData uri="http://schemas.openxmlformats.org/drawingml/2006/picture">
-                <pic:pic>
-                  <pic:nvPicPr>
-                    <pic:cNvPr id="0" name="image.png"/>
-                    <pic:cNvPicPr/>
-                  </pic:nvPicPr>
-                  <pic:blipFill>
-                    <a:blip r:embed="rId10"/>
-                    <a:stretch>
-                      <a:fillRect/>
-                    </a:stretch>
-                  </pic:blipFill>
-                  <pic:spPr>
-                    <a:xfrm>
-                      <a:off x="0" y="0"/>
-                      <a:ext cx="5220000" cy="1517003"/>
-                    </a:xfrm>
-                    <a:prstGeom prst="rect"/>
-                  </pic:spPr>
-                </pic:pic>
-              </a:graphicData>
-            </a:graphic>
-          </wp:inline>
-        </w:drawing>
-      </w:r>
+      <m:oMathPara>
+        <m:oMath>
+          <m:box>
+            <m:e>
+              <m:sSub>
+                <m:e>
+                  <m:r>
+                    <m:rPr>
+                      <m:sty m:val="i"/>
+                    </m:rPr>
+                    <m:t>R</m:t>
+                  </m:r>
+                </m:e>
+                <m:sub>
+                  <m:r>
+                    <m:rPr>
+                      <m:sty m:val="i"/>
+                    </m:rPr>
+                    <m:t>i</m:t>
+                  </m:r>
+                </m:sub>
+              </m:sSub>
+              <m:r>
+                <m:rPr>
+                  <m:sty m:val="p"/>
+                </m:rPr>
+                <m:t>=</m:t>
+              </m:r>
+              <m:sSub>
+                <m:e>
+                  <m:r>
+                    <m:rPr>
+                      <m:sty m:val="p"/>
+                    </m:rPr>
+                    <m:t>max</m:t>
+                  </m:r>
+                </m:e>
+                <m:sub>
+                  <m:box>
+                    <m:e>
+                      <m:r>
+                        <m:rPr>
+                          <m:sty m:val="i"/>
+                        </m:rPr>
+                        <m:t>j</m:t>
+                      </m:r>
+                    </m:e>
+                  </m:box>
+                </m:sub>
+              </m:sSub>
+              <m:box>
+                <m:e>
+                  <m:d>
+                    <m:dPr>
+                      <m:begChr m:val="{"/>
+                      <m:endChr m:val="}"/>
+                    </m:dPr>
+                    <m:e>
+                      <m:box>
+                        <m:e>
+                          <m:sSub>
+                            <m:e>
+                              <m:r>
+                                <m:rPr>
+                                  <m:sty m:val="i"/>
+                                </m:rPr>
+                                <m:t>w</m:t>
+                              </m:r>
+                            </m:e>
+                            <m:sub>
+                              <m:r>
+                                <m:rPr>
+                                  <m:sty m:val="i"/>
+                                </m:rPr>
+                                <m:t>j</m:t>
+                              </m:r>
+                            </m:sub>
+                          </m:sSub>
+                          <m:f>
+                            <m:num>
+                              <m:box>
+                                <m:e>
+                                  <m:sSubSup>
+                                    <m:e>
+                                      <m:r>
+                                        <m:rPr>
+                                          <m:sty m:val="i"/>
+                                        </m:rPr>
+                                        <m:t>f</m:t>
+                                      </m:r>
+                                    </m:e>
+                                    <m:sub>
+                                      <m:r>
+                                        <m:rPr>
+                                          <m:sty m:val="i"/>
+                                        </m:rPr>
+                                        <m:t>j</m:t>
+                                      </m:r>
+                                    </m:sub>
+                                    <m:sup>
+                                      <m:r>
+                                        <m:rPr>
+                                          <m:sty m:val="p"/>
+                                        </m:rPr>
+                                        <m:t>*</m:t>
+                                      </m:r>
+                                    </m:sup>
+                                  </m:sSubSup>
+                                  <m:r>
+                                    <m:rPr>
+                                      <m:sty m:val="p"/>
+                                    </m:rPr>
+                                    <m:t>−</m:t>
+                                  </m:r>
+                                  <m:sSub>
+                                    <m:e>
+                                      <m:r>
+                                        <m:rPr>
+                                          <m:sty m:val="i"/>
+                                        </m:rPr>
+                                        <m:t>f</m:t>
+                                      </m:r>
+                                    </m:e>
+                                    <m:sub>
+                                      <m:box>
+                                        <m:e>
+                                          <m:r>
+                                            <m:rPr>
+                                              <m:sty m:val="i"/>
+                                            </m:rPr>
+                                            <m:t>i</m:t>
+                                          </m:r>
+                                          <m:r>
+                                            <m:rPr>
+                                              <m:sty m:val="i"/>
+                                            </m:rPr>
+                                            <m:t>j</m:t>
+                                          </m:r>
+                                        </m:e>
+                                      </m:box>
+                                    </m:sub>
+                                  </m:sSub>
+                                </m:e>
+                              </m:box>
+                            </m:num>
+                            <m:den>
+                              <m:box>
+                                <m:e>
+                                  <m:sSubSup>
+                                    <m:e>
+                                      <m:r>
+                                        <m:rPr>
+                                          <m:sty m:val="i"/>
+                                        </m:rPr>
+                                        <m:t>f</m:t>
+                                      </m:r>
+                                    </m:e>
+                                    <m:sub>
+                                      <m:r>
+                                        <m:rPr>
+                                          <m:sty m:val="i"/>
+                                        </m:rPr>
+                                        <m:t>j</m:t>
+                                      </m:r>
+                                    </m:sub>
+                                    <m:sup>
+                                      <m:r>
+                                        <m:rPr>
+                                          <m:sty m:val="p"/>
+                                        </m:rPr>
+                                        <m:t>*</m:t>
+                                      </m:r>
+                                    </m:sup>
+                                  </m:sSubSup>
+                                  <m:r>
+                                    <m:rPr>
+                                      <m:sty m:val="p"/>
+                                    </m:rPr>
+                                    <m:t>−</m:t>
+                                  </m:r>
+                                  <m:sSubSup>
+                                    <m:e>
+                                      <m:r>
+                                        <m:rPr>
+                                          <m:sty m:val="i"/>
+                                        </m:rPr>
+                                        <m:t>f</m:t>
+                                      </m:r>
+                                    </m:e>
+                                    <m:sub>
+                                      <m:r>
+                                        <m:rPr>
+                                          <m:sty m:val="i"/>
+                                        </m:rPr>
+                                        <m:t>j</m:t>
+                                      </m:r>
+                                    </m:sub>
+                                    <m:sup>
+                                      <m:r>
+                                        <m:rPr>
+                                          <m:sty m:val="p"/>
+                                        </m:rPr>
+                                        <m:t>−</m:t>
+                                      </m:r>
+                                    </m:sup>
+                                  </m:sSubSup>
+                                </m:e>
+                              </m:box>
+                            </m:den>
+                          </m:f>
+                        </m:e>
+                      </m:box>
+                    </m:e>
+                  </m:d>
+                </m:e>
+              </m:box>
+            </m:e>
+          </m:box>
+        </m:oMath>
+      </m:oMathPara>
     </w:p>
     <w:p>
       <w:pPr>
@@ -224,40 +602,276 @@
       <w:pPr>
         <w:jc w:val="center"/>
       </w:pPr>
-      <w:r>
-        <w:drawing>
-          <wp:inline xmlns:a="http://schemas.openxmlformats.org/drawingml/2006/main" xmlns:pic="http://schemas.openxmlformats.org/drawingml/2006/picture">
-            <wp:extent cx="5220000" cy="906297"/>
-            <wp:docPr id="3" name="Picture 3"/>
-            <wp:cNvGraphicFramePr>
-              <a:graphicFrameLocks noChangeAspect="1"/>
-            </wp:cNvGraphicFramePr>
-            <a:graphic>
-              <a:graphicData uri="http://schemas.openxmlformats.org/drawingml/2006/picture">
-                <pic:pic>
-                  <pic:nvPicPr>
-                    <pic:cNvPr id="0" name="image.png"/>
-                    <pic:cNvPicPr/>
-                  </pic:nvPicPr>
-                  <pic:blipFill>
-                    <a:blip r:embed="rId11"/>
-                    <a:stretch>
-                      <a:fillRect/>
-                    </a:stretch>
-                  </pic:blipFill>
-                  <pic:spPr>
-                    <a:xfrm>
-                      <a:off x="0" y="0"/>
-                      <a:ext cx="5220000" cy="906297"/>
-                    </a:xfrm>
-                    <a:prstGeom prst="rect"/>
-                  </pic:spPr>
-                </pic:pic>
-              </a:graphicData>
-            </a:graphic>
-          </wp:inline>
-        </w:drawing>
-      </w:r>
+      <m:oMathPara>
+        <m:oMath>
+          <m:box>
+            <m:e>
+              <m:sSub>
+                <m:e>
+                  <m:r>
+                    <m:rPr>
+                      <m:sty m:val="i"/>
+                    </m:rPr>
+                    <m:t>Q</m:t>
+                  </m:r>
+                </m:e>
+                <m:sub>
+                  <m:r>
+                    <m:rPr>
+                      <m:sty m:val="i"/>
+                    </m:rPr>
+                    <m:t>i</m:t>
+                  </m:r>
+                </m:sub>
+              </m:sSub>
+              <m:r>
+                <m:rPr>
+                  <m:sty m:val="p"/>
+                </m:rPr>
+                <m:t>=</m:t>
+              </m:r>
+              <m:r>
+                <m:rPr>
+                  <m:sty m:val="i"/>
+                </m:rPr>
+                <m:t>v</m:t>
+              </m:r>
+              <m:f>
+                <m:num>
+                  <m:box>
+                    <m:e>
+                      <m:sSub>
+                        <m:e>
+                          <m:r>
+                            <m:rPr>
+                              <m:sty m:val="i"/>
+                            </m:rPr>
+                            <m:t>S</m:t>
+                          </m:r>
+                        </m:e>
+                        <m:sub>
+                          <m:r>
+                            <m:rPr>
+                              <m:sty m:val="i"/>
+                            </m:rPr>
+                            <m:t>i</m:t>
+                          </m:r>
+                        </m:sub>
+                      </m:sSub>
+                      <m:r>
+                        <m:rPr>
+                          <m:sty m:val="p"/>
+                        </m:rPr>
+                        <m:t>−</m:t>
+                      </m:r>
+                      <m:sSup>
+                        <m:e>
+                          <m:r>
+                            <m:rPr>
+                              <m:sty m:val="i"/>
+                            </m:rPr>
+                            <m:t>S</m:t>
+                          </m:r>
+                        </m:e>
+                        <m:sup>
+                          <m:r>
+                            <m:rPr>
+                              <m:sty m:val="p"/>
+                            </m:rPr>
+                            <m:t>*</m:t>
+                          </m:r>
+                        </m:sup>
+                      </m:sSup>
+                    </m:e>
+                  </m:box>
+                </m:num>
+                <m:den>
+                  <m:box>
+                    <m:e>
+                      <m:sSup>
+                        <m:e>
+                          <m:r>
+                            <m:rPr>
+                              <m:sty m:val="i"/>
+                            </m:rPr>
+                            <m:t>S</m:t>
+                          </m:r>
+                        </m:e>
+                        <m:sup>
+                          <m:r>
+                            <m:rPr>
+                              <m:sty m:val="p"/>
+                            </m:rPr>
+                            <m:t>−</m:t>
+                          </m:r>
+                        </m:sup>
+                      </m:sSup>
+                      <m:r>
+                        <m:rPr>
+                          <m:sty m:val="p"/>
+                        </m:rPr>
+                        <m:t>−</m:t>
+                      </m:r>
+                      <m:sSup>
+                        <m:e>
+                          <m:r>
+                            <m:rPr>
+                              <m:sty m:val="i"/>
+                            </m:rPr>
+                            <m:t>S</m:t>
+                          </m:r>
+                        </m:e>
+                        <m:sup>
+                          <m:r>
+                            <m:rPr>
+                              <m:sty m:val="p"/>
+                            </m:rPr>
+                            <m:t>*</m:t>
+                          </m:r>
+                        </m:sup>
+                      </m:sSup>
+                    </m:e>
+                  </m:box>
+                </m:den>
+              </m:f>
+              <m:r>
+                <m:rPr>
+                  <m:sty m:val="p"/>
+                </m:rPr>
+                <m:t>+</m:t>
+              </m:r>
+              <m:r>
+                <m:rPr>
+                  <m:sty m:val="p"/>
+                </m:rPr>
+                <m:t>(</m:t>
+              </m:r>
+              <m:r>
+                <m:rPr>
+                  <m:sty m:val="p"/>
+                </m:rPr>
+                <m:t>1</m:t>
+              </m:r>
+              <m:r>
+                <m:rPr>
+                  <m:sty m:val="p"/>
+                </m:rPr>
+                <m:t>−</m:t>
+              </m:r>
+              <m:r>
+                <m:rPr>
+                  <m:sty m:val="i"/>
+                </m:rPr>
+                <m:t>v</m:t>
+              </m:r>
+              <m:r>
+                <m:rPr>
+                  <m:sty m:val="p"/>
+                </m:rPr>
+                <m:t>)</m:t>
+              </m:r>
+              <m:f>
+                <m:num>
+                  <m:box>
+                    <m:e>
+                      <m:sSub>
+                        <m:e>
+                          <m:r>
+                            <m:rPr>
+                              <m:sty m:val="i"/>
+                            </m:rPr>
+                            <m:t>R</m:t>
+                          </m:r>
+                        </m:e>
+                        <m:sub>
+                          <m:r>
+                            <m:rPr>
+                              <m:sty m:val="i"/>
+                            </m:rPr>
+                            <m:t>i</m:t>
+                          </m:r>
+                        </m:sub>
+                      </m:sSub>
+                      <m:r>
+                        <m:rPr>
+                          <m:sty m:val="p"/>
+                        </m:rPr>
+                        <m:t>−</m:t>
+                      </m:r>
+                      <m:sSup>
+                        <m:e>
+                          <m:r>
+                            <m:rPr>
+                              <m:sty m:val="i"/>
+                            </m:rPr>
+                            <m:t>R</m:t>
+                          </m:r>
+                        </m:e>
+                        <m:sup>
+                          <m:r>
+                            <m:rPr>
+                              <m:sty m:val="p"/>
+                            </m:rPr>
+                            <m:t>*</m:t>
+                          </m:r>
+                        </m:sup>
+                      </m:sSup>
+                    </m:e>
+                  </m:box>
+                </m:num>
+                <m:den>
+                  <m:box>
+                    <m:e>
+                      <m:sSup>
+                        <m:e>
+                          <m:r>
+                            <m:rPr>
+                              <m:sty m:val="i"/>
+                            </m:rPr>
+                            <m:t>R</m:t>
+                          </m:r>
+                        </m:e>
+                        <m:sup>
+                          <m:r>
+                            <m:rPr>
+                              <m:sty m:val="p"/>
+                            </m:rPr>
+                            <m:t>−</m:t>
+                          </m:r>
+                        </m:sup>
+                      </m:sSup>
+                      <m:r>
+                        <m:rPr>
+                          <m:sty m:val="p"/>
+                        </m:rPr>
+                        <m:t>−</m:t>
+                      </m:r>
+                      <m:sSup>
+                        <m:e>
+                          <m:r>
+                            <m:rPr>
+                              <m:sty m:val="i"/>
+                            </m:rPr>
+                            <m:t>R</m:t>
+                          </m:r>
+                        </m:e>
+                        <m:sup>
+                          <m:r>
+                            <m:rPr>
+                              <m:sty m:val="p"/>
+                            </m:rPr>
+                            <m:t>*</m:t>
+                          </m:r>
+                        </m:sup>
+                      </m:sSup>
+                    </m:e>
+                  </m:box>
+                </m:den>
+              </m:f>
+            </m:e>
+          </m:box>
+        </m:oMath>
+      </m:oMathPara>
     </w:p>
     <w:p>
       <w:pPr>
@@ -317,7 +931,7 @@
           <w:b/>
           <w:sz w:val="30"/>
         </w:rPr>
-        <w:t>پیوست: نحوه درج صحیح فرمول در Microsoft Word</w:t>
+        <w:t>پیوست: نحوه ویرایش فرمول‌های Equation در Word</w:t>
       </w:r>
     </w:p>
     <w:p>
@@ -331,7 +945,7 @@
           <w:b w:val="0"/>
           <w:sz w:val="24"/>
         </w:rPr>
-        <w:t>۱. کلیدهای Alt + = را بزنید تا کادر معادله باز شود.</w:t>
+        <w:t>فرمول‌های این سند به‌صورت Equation بومی Word (OMML) درج شده‌اند، نه تصویر.</w:t>
       </w:r>
     </w:p>
     <w:p>
@@ -345,7 +959,7 @@
           <w:b w:val="0"/>
           <w:sz w:val="24"/>
         </w:rPr>
-        <w:t>۲. در Word ۲۰۱۹/Microsoft 365: از تب Equation (معادله) گزینه Convert و سپس LaTeX را انتخاب کنید.</w:t>
+        <w:t>برای ویرایش: روی فرمول دوبارکلیک کنید یا آن را انتخاب کرده و از تب Equation تغییر دهید.</w:t>
       </w:r>
     </w:p>
     <w:p>
@@ -359,21 +973,7 @@
           <w:b w:val="0"/>
           <w:sz w:val="24"/>
         </w:rPr>
-        <w:t>۳. کد LaTeX را Paste کنید و Enter بزنید.</w:t>
-      </w:r>
-    </w:p>
-    <w:p>
-      <w:pPr>
-        <w:bidi w:val="1"/>
-        <w:jc w:val="both"/>
-      </w:pPr>
-      <w:r>
-        <w:rPr>
-          <w:rFonts w:ascii="Times New Roman" w:hAnsi="Times New Roman" w:cs="B Nazanin"/>
-          <w:b w:val="0"/>
-          <w:sz w:val="24"/>
-        </w:rPr>
-        <w:t>۴. سپس Convert → Professional را بزنید تا فرمول نهایی ساخته شود.</w:t>
+        <w:t>برای درج فرمول جدید: Alt + = سپس LaTeX یا UnicodeMath.</w:t>
       </w:r>
     </w:p>
     <w:p>
@@ -400,34 +1000,7 @@
           <w:b w:val="0"/>
           <w:sz w:val="24"/>
         </w:rPr>
-        <w:t>——— اگر LaTeX فعال نیست، از فرمت UnicodeMath استفاده کنید ———</w:t>
-      </w:r>
-    </w:p>
-    <w:p>
-      <w:pPr>
-        <w:bidi w:val="1"/>
-        <w:jc w:val="both"/>
-      </w:pPr>
-      <w:r>
-        <w:rPr>
-          <w:rFonts w:ascii="Times New Roman" w:hAnsi="Times New Roman" w:cs="B Nazanin"/>
-          <w:b w:val="0"/>
-          <w:sz w:val="24"/>
-        </w:rPr>
-        <w:t>پس از Paste در کادر معادله، بین بخش‌ها Space بزنید تا Word فرمول را بسازد.</w:t>
-      </w:r>
-    </w:p>
-    <w:p>
-      <w:pPr>
-        <w:bidi w:val="1"/>
-        <w:jc w:val="both"/>
-      </w:pPr>
-      <w:r>
-        <w:rPr>
-          <w:rFonts w:ascii="Times New Roman" w:hAnsi="Times New Roman" w:cs="B Nazanin"/>
-          <w:b w:val="0"/>
-          <w:sz w:val="24"/>
-        </w:rPr>
+        <w:t>LaTeX فرمول S_i:</w:t>
       </w:r>
     </w:p>
     <w:p>
@@ -437,59 +1010,9 @@
       <w:r>
         <w:rPr>
           <w:rFonts w:ascii="Cambria Math" w:hAnsi="Cambria Math"/>
-          <w:sz w:val="24"/>
+          <w:sz w:val="22"/>
         </w:rPr>
-        <w:t>S_i=\sum_(j=1)^n w_j ((f_j^*-f_ij))/(f_j^*-f_j^-)</w:t>
-      </w:r>
-    </w:p>
-    <w:p>
-      <w:pPr>
-        <w:bidi w:val="1"/>
-        <w:jc w:val="both"/>
-      </w:pPr>
-      <w:r>
-        <w:rPr>
-          <w:rFonts w:ascii="Times New Roman" w:hAnsi="Times New Roman" w:cs="B Nazanin"/>
-          <w:b w:val="0"/>
-          <w:sz w:val="24"/>
-        </w:rPr>
-      </w:r>
-    </w:p>
-    <w:p>
-      <w:pPr>
-        <w:jc w:val="left"/>
-      </w:pPr>
-      <w:r>
-        <w:rPr>
-          <w:rFonts w:ascii="Cambria Math" w:hAnsi="Cambria Math"/>
-          <w:sz w:val="24"/>
-        </w:rPr>
-        <w:t>R_i=\max_j(w_j ((f_j^*-f_ij))/(f_j^*-f_j^-))</w:t>
-      </w:r>
-    </w:p>
-    <w:p>
-      <w:pPr>
-        <w:bidi w:val="1"/>
-        <w:jc w:val="both"/>
-      </w:pPr>
-      <w:r>
-        <w:rPr>
-          <w:rFonts w:ascii="Times New Roman" w:hAnsi="Times New Roman" w:cs="B Nazanin"/>
-          <w:b w:val="0"/>
-          <w:sz w:val="24"/>
-        </w:rPr>
-      </w:r>
-    </w:p>
-    <w:p>
-      <w:pPr>
-        <w:jc w:val="left"/>
-      </w:pPr>
-      <w:r>
-        <w:rPr>
-          <w:rFonts w:ascii="Cambria Math" w:hAnsi="Cambria Math"/>
-          <w:sz w:val="24"/>
-        </w:rPr>
-        <w:t>Q_i=v ((S_i-S^*))/(S^- -S^*)+(1-v) ((R_i-R^*))/(R^- -R^*)</w:t>
+        <w:t>S_i=\sum_{j=1}^{n} w_j \frac{f_j^* - f_{ij}}{f_j^* - f_j^-}</w:t>
       </w:r>
     </w:p>
     <w:p>
@@ -516,7 +1039,19 @@
           <w:b w:val="0"/>
           <w:sz w:val="24"/>
         </w:rPr>
-        <w:t>نکات:</w:t>
+        <w:t>LaTeX فرمول R_i:</w:t>
+      </w:r>
+    </w:p>
+    <w:p>
+      <w:pPr>
+        <w:jc w:val="left"/>
+      </w:pPr>
+      <w:r>
+        <w:rPr>
+          <w:rFonts w:ascii="Cambria Math" w:hAnsi="Cambria Math"/>
+          <w:sz w:val="22"/>
+        </w:rPr>
+        <w:t>R_i=\max_{j}\left\{w_j \frac{f_j^* - f_{ij}}{f_j^* - f_j^-}\right\}</w:t>
       </w:r>
     </w:p>
     <w:p>
@@ -530,7 +1065,6 @@
           <w:b w:val="0"/>
           <w:sz w:val="24"/>
         </w:rPr>
-        <w:t>• فرمول را فقط داخل کادر معادله Paste کنید، نه در متن عادی.</w:t>
       </w:r>
     </w:p>
     <w:p>
@@ -544,26 +1078,24 @@
           <w:b w:val="0"/>
           <w:sz w:val="24"/>
         </w:rPr>
-        <w:t>• اگر نمایش به‌هم‌ریخته شد، معادله را انتخاب کنید و Linear را به Professional تبدیل کنید.</w:t>
+        <w:t>LaTeX فرمول Q_i:</w:t>
       </w:r>
     </w:p>
     <w:p>
       <w:pPr>
-        <w:bidi w:val="1"/>
-        <w:jc w:val="both"/>
+        <w:jc w:val="left"/>
       </w:pPr>
       <w:r>
         <w:rPr>
-          <w:rFonts w:ascii="Times New Roman" w:hAnsi="Times New Roman" w:cs="B Nazanin"/>
-          <w:b w:val="0"/>
-          <w:sz w:val="24"/>
+          <w:rFonts w:ascii="Cambria Math" w:hAnsi="Cambria Math"/>
+          <w:sz w:val="22"/>
         </w:rPr>
-        <w:t>• برای زیرنویس از _ و برای توان از ^ استفاده کنید.</w:t>
+        <w:t>Q_i = v\frac{S_i-S^*}{S^- - S^*} + (1-v)\frac{R_i-R^*}{R^- - R^*}</w:t>
       </w:r>
     </w:p>
     <w:sectPr>
-      <w:pgSz w:w="12240" w:h="15840"/>
-      <w:pgMar w:top="1440" w:right="1800" w:bottom="1440" w:left="1800" w:header="720" w:footer="720" w:gutter="0"/>
+      <w:pgSz w:w="11906" w:h="16838"/>
+      <w:pgMar w:top="1440" w:right="1417" w:bottom="1440" w:left="1417" w:header="720" w:footer="720" w:gutter="0"/>
       <w:cols w:space="720"/>
       <w:docGrid w:linePitch="360"/>
     </w:sectPr>

</xml_diff>